<commit_message>
Aplica padrão de comunicação (datas DD/MM/AAAA, textos curtos e diretos)
Reformata todas as datas nos entregáveis (planilha, painel, relatório,
apresentação) para DD/MM/AAAA. Reescreve os textos de observação da
aba Análise por Veículo e das Ocorrências no formato Problema → Data →
Situação atual → Ação necessária, removendo linguagem longa/técnica
("período observado", "cobertura de apenas X dia(s)", "indício de
correção conforme regra do estudo"). Renomeia a classificação "Sem
reporte em todo o período observado" para "Sem reporte em todo o
período" e propaga a mudança por planilha, painel, relatório e slides.

Co-Authored-By: Claude Sonnet 5 <noreply@anthropic.com>
Claude-Session: https://claude.ai/code/session_0141CE691yg2zKR9cVjoqoFW
</commit_message>
<xml_diff>
--- a/gestao-combustivel/relatorios/Relatorio_Executivo_Combustivel.docx
+++ b/gestao-combustivel/relatorios/Relatorio_Executivo_Combustivel.docx
@@ -820,7 +820,7 @@
                 <w:sz w:val="19"/>
                 <w:szCs w:val="19"/>
               </w:rPr>
-              <w:t xml:space="preserve">Sem reporte em todo o período observado</w:t>
+              <w:t xml:space="preserve">Sem reporte em todo o período</w:t>
             </w:r>
           </w:p>
         </w:tc>
@@ -981,7 +981,7 @@
         <w:spacing w:after="80"/>
       </w:pPr>
       <w:r>
-        <w:t xml:space="preserve">10 veículo(s) não reportaram nenhuma média numérica na semana inteira, apesar de rodarem — alguns percorreram mais de 2.000 km sem qualquer dado de consumo capturado.</w:t>
+        <w:t xml:space="preserve">10 veículo(s) não informaram média em nenhum dia da semana, apesar de terem rodado — alguns percorreram mais de 2.000 km sem nenhum dado de consumo.</w:t>
       </w:r>
     </w:p>
     <w:p>
@@ -994,7 +994,7 @@
         <w:spacing w:after="80"/>
       </w:pPr>
       <w:r>
-        <w:t xml:space="preserve">12 veículo(s) apresentaram uma interrupção pontual (1 dia) seguida de retomada — indício de correção, sem confirmação de manutenção registrada nesta base.</w:t>
+        <w:t xml:space="preserve">12 veículo(s) ficaram um dia sem média e voltaram a informar. Verificar se houve alguma intervenção — não há registro de manutenção nesta base.</w:t>
       </w:r>
     </w:p>
     <w:p>
@@ -1292,7 +1292,7 @@
                 <w:sz w:val="19"/>
                 <w:szCs w:val="19"/>
               </w:rPr>
-              <w:t xml:space="preserve">2026-09-14</w:t>
+              <w:t xml:space="preserve">14/09/2026</w:t>
             </w:r>
           </w:p>
         </w:tc>
@@ -1405,7 +1405,7 @@
                 <w:sz w:val="19"/>
                 <w:szCs w:val="19"/>
               </w:rPr>
-              <w:t xml:space="preserve">2026-09-14</w:t>
+              <w:t xml:space="preserve">14/09/2026</w:t>
             </w:r>
           </w:p>
         </w:tc>
@@ -1518,7 +1518,7 @@
                 <w:sz w:val="19"/>
                 <w:szCs w:val="19"/>
               </w:rPr>
-              <w:t xml:space="preserve">2026-09-14</w:t>
+              <w:t xml:space="preserve">14/09/2026</w:t>
             </w:r>
           </w:p>
         </w:tc>
@@ -1631,7 +1631,7 @@
                 <w:sz w:val="19"/>
                 <w:szCs w:val="19"/>
               </w:rPr>
-              <w:t xml:space="preserve">2026-09-13</w:t>
+              <w:t xml:space="preserve">13/09/2026</w:t>
             </w:r>
           </w:p>
         </w:tc>
@@ -1700,7 +1700,7 @@
                 <w:sz w:val="19"/>
                 <w:szCs w:val="19"/>
               </w:rPr>
-              <w:t xml:space="preserve">Sem reporte em todo o período observado</w:t>
+              <w:t xml:space="preserve">Sem reporte em todo o período</w:t>
             </w:r>
           </w:p>
         </w:tc>
@@ -1744,7 +1744,7 @@
                 <w:sz w:val="19"/>
                 <w:szCs w:val="19"/>
               </w:rPr>
-              <w:t xml:space="preserve">2026-09-14</w:t>
+              <w:t xml:space="preserve">14/09/2026</w:t>
             </w:r>
           </w:p>
         </w:tc>
@@ -1813,7 +1813,7 @@
                 <w:sz w:val="19"/>
                 <w:szCs w:val="19"/>
               </w:rPr>
-              <w:t xml:space="preserve">Sem reporte em todo o período observado</w:t>
+              <w:t xml:space="preserve">Sem reporte em todo o período</w:t>
             </w:r>
           </w:p>
         </w:tc>
@@ -1857,7 +1857,7 @@
                 <w:sz w:val="19"/>
                 <w:szCs w:val="19"/>
               </w:rPr>
-              <w:t xml:space="preserve">2026-09-14</w:t>
+              <w:t xml:space="preserve">14/09/2026</w:t>
             </w:r>
           </w:p>
         </w:tc>
@@ -1926,7 +1926,7 @@
                 <w:sz w:val="19"/>
                 <w:szCs w:val="19"/>
               </w:rPr>
-              <w:t xml:space="preserve">Sem reporte em todo o período observado</w:t>
+              <w:t xml:space="preserve">Sem reporte em todo o período</w:t>
             </w:r>
           </w:p>
         </w:tc>
@@ -1970,7 +1970,7 @@
                 <w:sz w:val="19"/>
                 <w:szCs w:val="19"/>
               </w:rPr>
-              <w:t xml:space="preserve">2026-09-14</w:t>
+              <w:t xml:space="preserve">14/09/2026</w:t>
             </w:r>
           </w:p>
         </w:tc>
@@ -2039,7 +2039,7 @@
                 <w:sz w:val="19"/>
                 <w:szCs w:val="19"/>
               </w:rPr>
-              <w:t xml:space="preserve">Sem reporte em todo o período observado</w:t>
+              <w:t xml:space="preserve">Sem reporte em todo o período</w:t>
             </w:r>
           </w:p>
         </w:tc>
@@ -2083,7 +2083,7 @@
                 <w:sz w:val="19"/>
                 <w:szCs w:val="19"/>
               </w:rPr>
-              <w:t xml:space="preserve">2026-09-14</w:t>
+              <w:t xml:space="preserve">14/09/2026</w:t>
             </w:r>
           </w:p>
         </w:tc>

</xml_diff>